<commit_message>
Refresh Experiment 9 for doctor workspace while preserving original format
</commit_message>
<xml_diff>
--- a/docs/experiment9/Experiment9.docx
+++ b/docs/experiment9/Experiment9.docx
@@ -475,7 +475,7 @@
     </w:p>
     <w:p>
       <w:r>
-        <w:t>Aurelia Care supports patient authentication, doctor search, appointment booking, schedules, and administration. This experiment selects only login and appointment booking. Supporting checks inspect authentication, payment failure, time boundaries, concurrency, and transaction rollback.</w:t>
+        <w:t>Aurelia Care now provides separate patient and doctor workspaces. Login and appointment booking remain the two main functionalities. Supporting checks cover doctor accounts, patient-history privacy, Excel exports, leave, notifications, payment failure, concurrency, and rollback.</w:t>
       </w:r>
     </w:p>
     <w:tbl>
@@ -567,7 +567,7 @@
                 <w:rFonts w:ascii="Times New Roman" w:hAnsi="Times New Roman"/>
                 <w:sz w:val="19"/>
               </w:rPr>
-              <w:t>b9663ffdcb771e8cf48beff67546490351794bcb</w:t>
+              <w:t>cb1f2e03473ce691f4e1b8cdbf61c13f3d8e1aaf</w:t>
             </w:r>
           </w:p>
         </w:tc>
@@ -1048,7 +1048,7 @@
                 <w:rFonts w:ascii="Times New Roman" w:hAnsi="Times New Roman"/>
                 <w:sz w:val="19"/>
               </w:rPr>
-              <w:t>Doctor / consultation fee</w:t>
+              <w:t>Doctors / consultation fee</w:t>
             </w:r>
           </w:p>
         </w:tc>
@@ -1065,7 +1065,7 @@
                 <w:rFonts w:ascii="Times New Roman" w:hAnsi="Times New Roman"/>
                 <w:sz w:val="19"/>
               </w:rPr>
-              <w:t>Dr. Jhatka / INR 1,200</w:t>
+              <w:t>Six named accounts; Dr. Jhatka / INR 1,200</w:t>
             </w:r>
           </w:p>
         </w:tc>
@@ -1235,7 +1235,7 @@
         <w:pStyle w:val="ListBullet"/>
       </w:pPr>
       <w:r>
-        <w:t>White-box analysis: login rejection and success, availability guards, payment branch, password verifier, and rollback after writes.</w:t>
+        <w:t>White-box analysis: role/history guards, availability and leave, payment branches, scoped Excel exports, and rollback.</w:t>
       </w:r>
     </w:p>
     <w:p>
@@ -2565,7 +2565,7 @@
                 <w:rFonts w:ascii="Times New Roman" w:hAnsi="Times New Roman"/>
                 <w:sz w:val="18"/>
               </w:rPr>
-              <w:t>Account roles and access</w:t>
+              <w:t>Roles and six doctor accounts</w:t>
             </w:r>
           </w:p>
         </w:tc>
@@ -2599,7 +2599,7 @@
                 <w:rFonts w:ascii="Times New Roman" w:hAnsi="Times New Roman"/>
                 <w:sz w:val="18"/>
               </w:rPr>
-              <w:t>Active patient, doctor, admin</w:t>
+              <w:t>Patient, admin, six doctors active</w:t>
             </w:r>
           </w:p>
         </w:tc>
@@ -2616,7 +2616,7 @@
                 <w:rFonts w:ascii="Times New Roman" w:hAnsi="Times New Roman"/>
                 <w:sz w:val="18"/>
               </w:rPr>
-              <w:t>Valid credentials per role</w:t>
+              <w:t>Valid credentials per account</w:t>
             </w:r>
           </w:p>
         </w:tc>
@@ -2633,7 +2633,7 @@
                 <w:rFonts w:ascii="Times New Roman" w:hAnsi="Times New Roman"/>
                 <w:sz w:val="18"/>
               </w:rPr>
-              <w:t>Login each role; patient requests admin users</w:t>
+              <w:t>Login roles and each doctor; check profile; try booking/admin export</w:t>
             </w:r>
           </w:p>
         </w:tc>
@@ -2650,7 +2650,7 @@
                 <w:rFonts w:ascii="Times New Roman" w:hAnsi="Times New Roman"/>
                 <w:sz w:val="18"/>
               </w:rPr>
-              <w:t>Correct role; patient admin access 403</w:t>
+              <w:t>Correct identity; doctor booking/admin export 403</w:t>
             </w:r>
           </w:p>
         </w:tc>
@@ -2667,7 +2667,7 @@
                 <w:rFonts w:ascii="Times New Roman" w:hAnsi="Times New Roman"/>
                 <w:sz w:val="18"/>
               </w:rPr>
-              <w:t>All 3 roles matched; restricted request 403</w:t>
+              <w:t>Three roles correct; six doctor IDs matched; forbidden actions 403</w:t>
             </w:r>
           </w:p>
         </w:tc>
@@ -2701,7 +2701,7 @@
                 <w:rFonts w:ascii="Times New Roman" w:hAnsi="Times New Roman"/>
                 <w:sz w:val="18"/>
               </w:rPr>
-              <w:t>API roles; no claim of all UI routes</w:t>
+              <w:t>Separate doctor workspace verified</w:t>
             </w:r>
           </w:p>
         </w:tc>
@@ -3509,7 +3509,7 @@
                 <w:rFonts w:ascii="Times New Roman" w:hAnsi="Times New Roman"/>
                 <w:sz w:val="18"/>
               </w:rPr>
-              <w:t>Occupied slot</w:t>
+              <w:t>Occupied or leave-covered slot</w:t>
             </w:r>
           </w:p>
         </w:tc>
@@ -3543,7 +3543,7 @@
                 <w:rFonts w:ascii="Times New Roman" w:hAnsi="Times New Roman"/>
                 <w:sz w:val="18"/>
               </w:rPr>
-              <w:t>First patient already booked slot</w:t>
+              <w:t>Slot booked, or doctor on leave</w:t>
             </w:r>
           </w:p>
         </w:tc>
@@ -3560,7 +3560,7 @@
                 <w:rFonts w:ascii="Times New Roman" w:hAnsi="Times New Roman"/>
                 <w:sz w:val="18"/>
               </w:rPr>
-              <w:t>Second patient; same slot</w:t>
+              <w:t>Unavailable slot identifier</w:t>
             </w:r>
           </w:p>
         </w:tc>
@@ -3577,7 +3577,7 @@
                 <w:rFonts w:ascii="Times New Roman" w:hAnsi="Times New Roman"/>
                 <w:sz w:val="18"/>
               </w:rPr>
-              <w:t>Book slot again; compare records</w:t>
+              <w:t>Try booking each unavailable slot; inspect records</w:t>
             </w:r>
           </w:p>
         </w:tc>
@@ -3594,7 +3594,7 @@
                 <w:rFonts w:ascii="Times New Roman" w:hAnsi="Times New Roman"/>
                 <w:sz w:val="18"/>
               </w:rPr>
-              <w:t>409; no duplicate changes</w:t>
+              <w:t>409; no duplicate or leave-time booking</w:t>
             </w:r>
           </w:p>
         </w:tc>
@@ -3611,7 +3611,7 @@
                 <w:rFonts w:ascii="Times New Roman" w:hAnsi="Times New Roman"/>
                 <w:sz w:val="18"/>
               </w:rPr>
-              <w:t>409; snapshot unchanged</w:t>
+              <w:t>409 for both scenarios; records protected</w:t>
             </w:r>
           </w:p>
         </w:tc>
@@ -3645,7 +3645,7 @@
                 <w:rFonts w:ascii="Times New Roman" w:hAnsi="Times New Roman"/>
                 <w:sz w:val="18"/>
               </w:rPr>
-              <w:t>Availability guard</w:t>
+              <w:t>Availability and leave guards</w:t>
             </w:r>
           </w:p>
         </w:tc>
@@ -4384,7 +4384,7 @@
                 <w:rFonts w:ascii="Times New Roman" w:hAnsi="Times New Roman"/>
                 <w:sz w:val="18"/>
               </w:rPr>
-              <w:t>Booking persistence</w:t>
+              <w:t>Booking and history persistence</w:t>
             </w:r>
           </w:p>
         </w:tc>
@@ -4418,7 +4418,7 @@
                 <w:rFonts w:ascii="Times New Roman" w:hAnsi="Times New Roman"/>
                 <w:sz w:val="18"/>
               </w:rPr>
-              <w:t>Successful booking exists</w:t>
+              <w:t>Booking and medical history saved</w:t>
             </w:r>
           </w:p>
         </w:tc>
@@ -4435,7 +4435,7 @@
                 <w:rFonts w:ascii="Times New Roman" w:hAnsi="Times New Roman"/>
                 <w:sz w:val="18"/>
               </w:rPr>
-              <w:t>Saved appointment ID</w:t>
+              <w:t>Saved appointment; history fields</w:t>
             </w:r>
           </w:p>
         </w:tc>
@@ -4452,7 +4452,7 @@
                 <w:rFonts w:ascii="Times New Roman" w:hAnsi="Times New Roman"/>
                 <w:sz w:val="18"/>
               </w:rPr>
-              <w:t>Logout; reinitialize schema; login; GET booking</w:t>
+              <w:t>Restart initialization; sign in; retrieve own records</w:t>
             </w:r>
           </w:p>
         </w:tc>
@@ -4469,7 +4469,7 @@
                 <w:rFonts w:ascii="Times New Roman" w:hAnsi="Times New Roman"/>
                 <w:sz w:val="18"/>
               </w:rPr>
-              <w:t>Saved record remains identical</w:t>
+              <w:t>Booking/history persist; passwords retained</w:t>
             </w:r>
           </w:p>
         </w:tc>
@@ -4486,7 +4486,7 @@
                 <w:rFonts w:ascii="Times New Roman" w:hAnsi="Times New Roman"/>
                 <w:sz w:val="18"/>
               </w:rPr>
-              <w:t>200; full response equals saved response</w:t>
+              <w:t>Booking identical; history and credentials preserved</w:t>
             </w:r>
           </w:p>
         </w:tc>
@@ -4520,7 +4520,7 @@
                 <w:rFonts w:ascii="Times New Roman" w:hAnsi="Times New Roman"/>
                 <w:sz w:val="18"/>
               </w:rPr>
-              <w:t>New authenticated client</w:t>
+              <w:t>Isolated restart checks</w:t>
             </w:r>
           </w:p>
         </w:tc>
@@ -4551,7 +4551,7 @@
     </w:p>
     <w:p>
       <w:r>
-        <w:t>Source inspection identified the login rejection condition, password verification, slot guards, payment branch, and transaction boundaries. The following seven additional pytest cases exercise these paths. They complement the sixteen functional cases.</w:t>
+        <w:t>The seven supporting cases below complement the sixteen functional cases. Fifteen extension tests additionally verify doctor accounts, history ownership/cancellation revocation, scoped Excel downloads, leave/import guards, alerts, migration, and local login guides.</w:t>
       </w:r>
     </w:p>
     <w:tbl>
@@ -4902,7 +4902,7 @@
                 <w:rFonts w:ascii="Times New Roman" w:hAnsi="Times New Roman"/>
                 <w:sz w:val="19"/>
               </w:rPr>
-              <w:t>Missing slot; doctor role calls patient booking API</w:t>
+              <w:t>Missing slot and role guards; scoped history/export checks</w:t>
             </w:r>
           </w:p>
         </w:tc>
@@ -4919,7 +4919,7 @@
                 <w:rFonts w:ascii="Times New Roman" w:hAnsi="Times New Roman"/>
                 <w:sz w:val="19"/>
               </w:rPr>
-              <w:t>404 for missing slot; 403 for doctor</w:t>
+              <w:t>Missing slot 404; doctor booking 403; unrelated history 404; private exports scoped</w:t>
             </w:r>
           </w:p>
         </w:tc>
@@ -4975,7 +4975,7 @@
                 <w:rFonts w:ascii="Times New Roman" w:hAnsi="Times New Roman"/>
                 <w:sz w:val="19"/>
               </w:rPr>
-              <w:t>Slot belongs to inactive doctor</w:t>
+              <w:t>Inactive doctor and unavailable-period guards</w:t>
             </w:r>
           </w:p>
         </w:tc>
@@ -4992,7 +4992,7 @@
                 <w:rFonts w:ascii="Times New Roman" w:hAnsi="Times New Roman"/>
                 <w:sz w:val="19"/>
               </w:rPr>
-              <w:t>404; slot rejected</w:t>
+              <w:t>Inactive doctor 404; leave-time booking 409; conflicting leave rejected</w:t>
             </w:r>
           </w:p>
         </w:tc>
@@ -5176,7 +5176,7 @@
     </w:p>
     <w:p>
       <w:r>
-        <w:t>The focused 23-case run was instrumented with coverage.py branch tracing. The figures below apply only to the named functions, not the whole application.</w:t>
+        <w:t>The focused 38-test run (23 core + 15 extension tests) used coverage.py branch tracing. Figures apply only to the named functions, not the whole application.</w:t>
       </w:r>
     </w:p>
     <w:tbl>
@@ -5344,24 +5344,24 @@
                 <w:rFonts w:ascii="Times New Roman" w:hAnsi="Times New Roman"/>
                 <w:sz w:val="19"/>
               </w:rPr>
+              <w:t>10 / 10 (100%)</w:t>
+            </w:r>
+          </w:p>
+        </w:tc>
+        <w:tc>
+          <w:tcPr>
+            <w:tcW w:type="dxa" w:w="3364"/>
+          </w:tcPr>
+          <w:p>
+            <w:pPr>
+              <w:spacing w:after="40" w:line="240" w:lineRule="auto"/>
+            </w:pPr>
+            <w:r>
+              <w:rPr>
+                <w:rFonts w:ascii="Times New Roman" w:hAnsi="Times New Roman"/>
+                <w:sz w:val="19"/>
+              </w:rPr>
               <w:t>8 / 8 (100%)</w:t>
-            </w:r>
-          </w:p>
-        </w:tc>
-        <w:tc>
-          <w:tcPr>
-            <w:tcW w:type="dxa" w:w="3364"/>
-          </w:tcPr>
-          <w:p>
-            <w:pPr>
-              <w:spacing w:after="40" w:line="240" w:lineRule="auto"/>
-            </w:pPr>
-            <w:r>
-              <w:rPr>
-                <w:rFonts w:ascii="Times New Roman" w:hAnsi="Times New Roman"/>
-                <w:sz w:val="19"/>
-              </w:rPr>
-              <w:t>6 / 6 (100%)</w:t>
             </w:r>
           </w:p>
         </w:tc>
@@ -5586,7 +5586,7 @@
                 <w:rFonts w:ascii="Times New Roman" w:hAnsi="Times New Roman"/>
                 <w:sz w:val="19"/>
               </w:rPr>
-              <w:t>23 passed; 0 failed; 0 skipped — 27.56 seconds</w:t>
+              <w:t>38 passed; 0 failed; 0 skipped — 43.21 seconds; 23 core + 15 extension</w:t>
             </w:r>
           </w:p>
         </w:tc>
@@ -5625,7 +5625,7 @@
                 <w:rFonts w:ascii="Times New Roman" w:hAnsi="Times New Roman"/>
                 <w:sz w:val="19"/>
               </w:rPr>
-              <w:t>21 passed; 0 failed; 0 skipped — 17.59 seconds</w:t>
+              <w:t>Latest recorded run: 41 passed; 0 failed; 0 skipped — 38.56 seconds</w:t>
             </w:r>
           </w:p>
         </w:tc>
@@ -5647,7 +5647,7 @@
                 <w:rFonts w:ascii="Times New Roman" w:hAnsi="Times New Roman"/>
                 <w:sz w:val="19"/>
               </w:rPr>
-              <w:t>Fresh browser checks</w:t>
+              <w:t>Latest browser checks</w:t>
             </w:r>
           </w:p>
         </w:tc>
@@ -5664,7 +5664,7 @@
                 <w:rFonts w:ascii="Times New Roman" w:hAnsi="Times New Roman"/>
                 <w:sz w:val="19"/>
               </w:rPr>
-              <w:t>4 scenarios passed: rejected login, successful login, failed payment, successful retry / confirmation</w:t>
+              <w:t>9 workflows passed: patient/doctor/admin, histories, Excel, leave, and 15-second notification refresh</w:t>
             </w:r>
           </w:p>
         </w:tc>
@@ -5782,7 +5782,7 @@
         <w:jc w:val="center"/>
       </w:pPr>
       <w:r>
-        <w:t>Figure 1. Incorrect credentials rejected with the application’s generic login error (LG-02).</w:t>
+        <w:t>Figure 1. Named doctor login opens a dedicated practice workspace (LG-07).</w:t>
       </w:r>
     </w:p>
     <w:p>
@@ -5830,7 +5830,7 @@
         <w:jc w:val="center"/>
       </w:pPr>
       <w:r>
-        <w:t>Figure 2. Simulated payment declined; the dialog reports that no appointment was booked (BK-05).</w:t>
+        <w:t>Figure 2. A treating doctor views their own patient’s medical history; unrelated access is denied by API tests.</w:t>
       </w:r>
     </w:p>
     <w:p>
@@ -5896,7 +5896,7 @@
         <w:jc w:val="center"/>
       </w:pPr>
       <w:r>
-        <w:t>Figure 3. Successful retry creates a confirmed appointment with simulated payment (BK-01 / BK-06).</w:t>
+        <w:t>Figure 3. The updated system confirms a patient booking after successful simulated payment (BK-01 / BK-06).</w:t>
       </w:r>
     </w:p>
     <w:p>
@@ -5909,7 +5909,7 @@
     </w:p>
     <w:p>
       <w:r>
-        <w:t>Machine-readable JUnit results, the focused run log, coverage JSON, test source, and browser script are included in the accompanying evidence archive. The exact API outcomes used in the case tables are asserted by those tests.</w:t>
+        <w:t>The evidence archive includes JUnit results, the new focused-run log, coverage JSON, test source, and browser checks. Screenshots are from the latest verified doctor-workspace run. The 38-test and 41-test suites overlap and are not additive.</w:t>
       </w:r>
     </w:p>
     <w:tbl>
@@ -6001,7 +6001,7 @@
                 <w:rFonts w:ascii="Times New Roman" w:hAnsi="Times New Roman"/>
                 <w:sz w:val="19"/>
               </w:rPr>
-              <w:t>Existing 21-test regression suite</w:t>
+              <w:t>Latest recorded 41-test regression suite</w:t>
             </w:r>
           </w:p>
         </w:tc>
@@ -6023,7 +6023,7 @@
                 <w:rFonts w:ascii="Times New Roman" w:hAnsi="Times New Roman"/>
                 <w:sz w:val="19"/>
               </w:rPr>
-              <w:t>coverage run --branch ... pytest test_experiment9.py -v</w:t>
+              <w:t>coverage run --branch ... pytest core and clinical tests</w:t>
             </w:r>
           </w:p>
         </w:tc>
@@ -6040,7 +6040,7 @@
                 <w:rFonts w:ascii="Times New Roman" w:hAnsi="Times New Roman"/>
                 <w:sz w:val="19"/>
               </w:rPr>
-              <w:t>Focused 23-test run with source coverage</w:t>
+              <w:t>Fresh 38-test run with source coverage</w:t>
             </w:r>
           </w:p>
         </w:tc>
@@ -6101,7 +6101,7 @@
                 <w:rFonts w:ascii="Times New Roman" w:hAnsi="Times New Roman"/>
                 <w:sz w:val="19"/>
               </w:rPr>
-              <w:t>node capture.mjs</w:t>
+              <w:t>Playwright clinical.spec.ts / workflows.spec.ts</w:t>
             </w:r>
           </w:p>
         </w:tc>
@@ -6118,7 +6118,7 @@
                 <w:rFonts w:ascii="Times New Roman" w:hAnsi="Times New Roman"/>
                 <w:sz w:val="19"/>
               </w:rPr>
-              <w:t>Four browser checks and three screenshots</w:t>
+              <w:t>Nine verified browser workflows and current screenshots</w:t>
             </w:r>
           </w:p>
         </w:tc>
@@ -6131,7 +6131,7 @@
     </w:p>
     <w:p>
       <w:r>
-        <w:t>An initial browser attempt on the lab’s alternate port was rejected by the existing Origin safeguard. The lab server was restarted with that exact local origin in ALLOWED_ORIGINS; the completed browser run then passed. Application source code was unchanged. The initial pre-permission API process was stopped and rerun with supported local networking.</w:t>
+        <w:t>The application source was unchanged for this report. The earlier custom-port defect is already corrected. The initial test process launched before networking permission was stopped; the completed instrumented run passed. Only fictional histories appear in evidence; installation passwords are excluded.</w:t>
       </w:r>
     </w:p>
     <w:p>
@@ -6165,7 +6165,7 @@
         <w:pStyle w:val="ListBullet"/>
       </w:pPr>
       <w:r>
-        <w:t>Logging out invalidated the saved session: replaying the previous cookie returned 401. Role checks denied a patient access to administrator user management.</w:t>
+        <w:t>Logout revoked the session. Six doctor identities matched their profiles; doctor accounts could not book as patients or download the administrator workbook.</w:t>
       </w:r>
     </w:p>
     <w:p>
@@ -6173,7 +6173,7 @@
         <w:pStyle w:val="ListBullet"/>
       </w:pPr>
       <w:r>
-        <w:t>Successful booking saved a confirmed appointment, matching simulated payment, and a booked slot. A new authenticated client retrieved the same record.</w:t>
+        <w:t>Booking saved consistent appointment/payment/slot records. Patient history persisted; only doctors with confirmed/completed consultations could retrieve or export it.</w:t>
       </w:r>
     </w:p>
     <w:p>
@@ -6197,7 +6197,7 @@
         <w:pStyle w:val="ListBullet"/>
       </w:pPr>
       <w:r>
-        <w:t>The frozen-clock tests demonstrated the exact time rule: a slot at or before the current time is rejected; a later slot can be booked.</w:t>
+        <w:t>Frozen-clock boundaries passed. Leave hid overlapping slots and blocked direct booking; confirmed appointments prevented conflicting leave.</w:t>
       </w:r>
     </w:p>
     <w:p>
@@ -6205,7 +6205,7 @@
         <w:pStyle w:val="ListBullet"/>
       </w:pPr>
       <w:r>
-        <w:t>A deliberate exception after database writes caused transaction rollback. No partial booking, payment, notification, or slot-state change remained.</w:t>
+        <w:t>Injected failure rolled back all writes. Doctor Excel exports excluded unrelated patients; notifications were scoped and browser updates refreshed after polling.</w:t>
       </w:r>
     </w:p>
     <w:p>
@@ -6226,12 +6226,12 @@
     </w:p>
     <w:p>
       <w:r>
-        <w:t>The aim was achieved by designing and executing test cases for login and appointment booking in the Doctor Appointment Booking System. All sixteen functional cases and seven supporting white-box/boundary cases passed. The twenty-one existing regression tests also passed, and four fresh browser scenarios supplied visual evidence.</w:t>
+        <w:t>The aim was achieved for login and appointment booking in the expanded two-sided system. All 16 functional, 7 supporting, and 15 extension tests passed (38 total). The latest recorded 41-test regression suite and 9 browser workflows also passed. Privacy, doctor exports, leave, and scoped alerts were verified.</w:t>
       </w:r>
     </w:p>
     <w:p>
       <w:r>
-        <w:t>The results support the tested authentication, booking, failure-handling, concurrency, and persistence behaviours for the identified source version in the Linux lab environment. They do not establish production performance, native Mac compatibility, or exhaustive correctness.</w:t>
+        <w:t>Results support the tested patient/doctor permissions, history privacy, scheduling, exports, booking, and persistence for the identified Linux source version. They do not establish production capacity, native Mac compatibility, or exhaustive correctness.</w:t>
       </w:r>
     </w:p>
     <w:p>

</xml_diff>